<commit_message>
Fix Brand Style Guide colors to match the University's actual design system
MKT-001's stated official color palette (Royal Blue #1A237E, Gold
#FFD700, Red #B71C1C) did not match the colors actually used on every
one of the nine published covers and premium tables (Navy #122A4E, Gold
#B08625, cream table-tint #F7F3E8). The Brand Style Guide is supposed to
be the authoritative record of what the University's own colors are;
instead it described a palette nobody had ever built to. Corrected the
table to cite the exact hex values already in use throughout the
publication suite, sourced directly from assets/assemble.py's NAVY_HEX
and BAND_TINT_HEX constants rather than re-guessing them.

Found during a cross-document single-source-of-truth consistency audit
across all nine flagship publications.

Co-Authored-By: Claude Sonnet 5 <noreply@anthropic.com>
Claude-Session: https://claude.ai/code/session_01S7a5B9cPrxgBw83YE1CtYn
</commit_message>
<xml_diff>
--- a/AMIU_Marketing_Communications_Handbook_2028.docx
+++ b/AMIU_Marketing_Communications_Handbook_2028.docx
@@ -3132,10 +3132,10 @@
         <w:tblLayout w:type="fixed"/>
       </w:tblPr>
       <w:tblGrid>
-        <w:gridCol w:w="1963"/>
-        <w:gridCol w:w="1873"/>
-        <w:gridCol w:w="2410"/>
-        <w:gridCol w:w="2826"/>
+        <w:gridCol w:w="1924"/>
+        <w:gridCol w:w="1815"/>
+        <w:gridCol w:w="2348"/>
+        <w:gridCol w:w="2985"/>
       </w:tblGrid>
       <w:tr>
         <w:trPr>
@@ -3155,7 +3155,7 @@
               <w:bottom w:val="single" w:sz="16" w:space="0" w:color="B08625"/>
             </w:tcBorders>
             <w:vAlign w:val="center"/>
-            <w:tcW w:w="1963" w:type="dxa"/>
+            <w:tcW w:w="1924" w:type="dxa"/>
           </w:tcPr>
           <w:p>
             <w:pPr>
@@ -3186,7 +3186,7 @@
               <w:bottom w:val="single" w:sz="16" w:space="0" w:color="B08625"/>
             </w:tcBorders>
             <w:vAlign w:val="center"/>
-            <w:tcW w:w="1873" w:type="dxa"/>
+            <w:tcW w:w="1815" w:type="dxa"/>
           </w:tcPr>
           <w:p>
             <w:pPr>
@@ -3217,7 +3217,7 @@
               <w:bottom w:val="single" w:sz="16" w:space="0" w:color="B08625"/>
             </w:tcBorders>
             <w:vAlign w:val="center"/>
-            <w:tcW w:w="2410" w:type="dxa"/>
+            <w:tcW w:w="2348" w:type="dxa"/>
           </w:tcPr>
           <w:p>
             <w:pPr>
@@ -3248,7 +3248,7 @@
               <w:bottom w:val="single" w:sz="16" w:space="0" w:color="B08625"/>
             </w:tcBorders>
             <w:vAlign w:val="center"/>
-            <w:tcW w:w="2826" w:type="dxa"/>
+            <w:tcW w:w="2985" w:type="dxa"/>
           </w:tcPr>
           <w:p>
             <w:pPr>
@@ -3281,7 +3281,7 @@
             </w:tcMar>
             <w:vAlign w:val="center"/>
             <w:shd w:val="clear" w:color="auto" w:fill="F7F3E8"/>
-            <w:tcW w:w="1963" w:type="dxa"/>
+            <w:tcW w:w="1924" w:type="dxa"/>
           </w:tcPr>
           <w:p>
             <w:pPr>
@@ -3289,7 +3289,7 @@
               <w:jc w:val="left"/>
             </w:pPr>
             <w:r>
-              <w:t xml:space="preserve">Royal Blue</w:t>
+              <w:t xml:space="preserve">Deep Navy</w:t>
             </w:r>
           </w:p>
         </w:tc>
@@ -3303,7 +3303,7 @@
             </w:tcMar>
             <w:vAlign w:val="center"/>
             <w:shd w:val="clear" w:color="auto" w:fill="F7F3E8"/>
-            <w:tcW w:w="1873" w:type="dxa"/>
+            <w:tcW w:w="1815" w:type="dxa"/>
           </w:tcPr>
           <w:p>
             <w:pPr>
@@ -3311,7 +3311,7 @@
               <w:jc w:val="left"/>
             </w:pPr>
             <w:r>
-              <w:t xml:space="preserve">#1A237E</w:t>
+              <w:t xml:space="preserve">#122A4E</w:t>
             </w:r>
           </w:p>
         </w:tc>
@@ -3325,7 +3325,7 @@
             </w:tcMar>
             <w:vAlign w:val="center"/>
             <w:shd w:val="clear" w:color="auto" w:fill="F7F3E8"/>
-            <w:tcW w:w="2410" w:type="dxa"/>
+            <w:tcW w:w="2348" w:type="dxa"/>
           </w:tcPr>
           <w:p>
             <w:pPr>
@@ -3333,7 +3333,7 @@
               <w:jc w:val="left"/>
             </w:pPr>
             <w:r>
-              <w:t xml:space="preserve">(26, 35, 126)</w:t>
+              <w:t xml:space="preserve">(18, 42, 78)</w:t>
             </w:r>
           </w:p>
         </w:tc>
@@ -3347,7 +3347,7 @@
             </w:tcMar>
             <w:vAlign w:val="center"/>
             <w:shd w:val="clear" w:color="auto" w:fill="F7F3E8"/>
-            <w:tcW w:w="2826" w:type="dxa"/>
+            <w:tcW w:w="2985" w:type="dxa"/>
           </w:tcPr>
           <w:p>
             <w:pPr>
@@ -3373,7 +3373,7 @@
               <w:right w:w="150" w:type="dxa"/>
             </w:tcMar>
             <w:vAlign w:val="center"/>
-            <w:tcW w:w="1963" w:type="dxa"/>
+            <w:tcW w:w="1924" w:type="dxa"/>
           </w:tcPr>
           <w:p>
             <w:pPr>
@@ -3394,7 +3394,7 @@
               <w:right w:w="150" w:type="dxa"/>
             </w:tcMar>
             <w:vAlign w:val="center"/>
-            <w:tcW w:w="1873" w:type="dxa"/>
+            <w:tcW w:w="1815" w:type="dxa"/>
           </w:tcPr>
           <w:p>
             <w:pPr>
@@ -3402,7 +3402,7 @@
               <w:jc w:val="left"/>
             </w:pPr>
             <w:r>
-              <w:t xml:space="preserve">#FFD700</w:t>
+              <w:t xml:space="preserve">#B08625</w:t>
             </w:r>
           </w:p>
         </w:tc>
@@ -3415,7 +3415,7 @@
               <w:right w:w="150" w:type="dxa"/>
             </w:tcMar>
             <w:vAlign w:val="center"/>
-            <w:tcW w:w="2410" w:type="dxa"/>
+            <w:tcW w:w="2348" w:type="dxa"/>
           </w:tcPr>
           <w:p>
             <w:pPr>
@@ -3423,7 +3423,7 @@
               <w:jc w:val="left"/>
             </w:pPr>
             <w:r>
-              <w:t xml:space="preserve">(255, 215, 0)</w:t>
+              <w:t xml:space="preserve">(176, 134, 37)</w:t>
             </w:r>
           </w:p>
         </w:tc>
@@ -3436,7 +3436,7 @@
               <w:right w:w="150" w:type="dxa"/>
             </w:tcMar>
             <w:vAlign w:val="center"/>
-            <w:tcW w:w="2826" w:type="dxa"/>
+            <w:tcW w:w="2985" w:type="dxa"/>
           </w:tcPr>
           <w:p>
             <w:pPr>
@@ -3463,7 +3463,7 @@
             </w:tcMar>
             <w:vAlign w:val="center"/>
             <w:shd w:val="clear" w:color="auto" w:fill="F7F3E8"/>
-            <w:tcW w:w="1963" w:type="dxa"/>
+            <w:tcW w:w="1924" w:type="dxa"/>
           </w:tcPr>
           <w:p>
             <w:pPr>
@@ -3471,7 +3471,7 @@
               <w:jc w:val="left"/>
             </w:pPr>
             <w:r>
-              <w:t xml:space="preserve">Red</w:t>
+              <w:t xml:space="preserve">Ivory</w:t>
             </w:r>
           </w:p>
         </w:tc>
@@ -3485,7 +3485,7 @@
             </w:tcMar>
             <w:vAlign w:val="center"/>
             <w:shd w:val="clear" w:color="auto" w:fill="F7F3E8"/>
-            <w:tcW w:w="1873" w:type="dxa"/>
+            <w:tcW w:w="1815" w:type="dxa"/>
           </w:tcPr>
           <w:p>
             <w:pPr>
@@ -3493,7 +3493,7 @@
               <w:jc w:val="left"/>
             </w:pPr>
             <w:r>
-              <w:t xml:space="preserve">#B71C1C</w:t>
+              <w:t xml:space="preserve">#F7F3E8</w:t>
             </w:r>
           </w:p>
         </w:tc>
@@ -3507,7 +3507,7 @@
             </w:tcMar>
             <w:vAlign w:val="center"/>
             <w:shd w:val="clear" w:color="auto" w:fill="F7F3E8"/>
-            <w:tcW w:w="2410" w:type="dxa"/>
+            <w:tcW w:w="2348" w:type="dxa"/>
           </w:tcPr>
           <w:p>
             <w:pPr>
@@ -3515,7 +3515,7 @@
               <w:jc w:val="left"/>
             </w:pPr>
             <w:r>
-              <w:t xml:space="preserve">(183, 28, 28)</w:t>
+              <w:t xml:space="preserve">(247, 243, 232)</w:t>
             </w:r>
           </w:p>
         </w:tc>
@@ -3529,7 +3529,7 @@
             </w:tcMar>
             <w:vAlign w:val="center"/>
             <w:shd w:val="clear" w:color="auto" w:fill="F7F3E8"/>
-            <w:tcW w:w="2826" w:type="dxa"/>
+            <w:tcW w:w="2985" w:type="dxa"/>
           </w:tcPr>
           <w:p>
             <w:pPr>
@@ -3537,7 +3537,7 @@
               <w:jc w:val="left"/>
             </w:pPr>
             <w:r>
-              <w:t xml:space="preserve">Accent color for urgency and calls to action</w:t>
+              <w:t xml:space="preserve">Tertiary color for backgrounds and panels</w:t>
             </w:r>
           </w:p>
         </w:tc>

</xml_diff>

<commit_message>
Fix Brand Style Guide's approved fonts to match the University's actual typography
Continuing the color-palette fix: MKT-001's Typography table stated the
University's approved fonts as Georgia (headings) and Times New Roman
(body/captions) — neither of which any of the nine published documents
actually uses. Corrected to the real three-role type system every front
matter's own "Typesetting and Publication Design" note describes and
build_reference.py implements: Fraunces (display/headings), Source
Serif 4 (body/reading), and Archivo (structural/captions).

Co-Authored-By: Claude Sonnet 5 <noreply@anthropic.com>
Claude-Session: https://claude.ai/code/session_01S7a5B9cPrxgBw83YE1CtYn
</commit_message>
<xml_diff>
--- a/AMIU_Marketing_Communications_Handbook_2028.docx
+++ b/AMIU_Marketing_Communications_Handbook_2028.docx
@@ -3679,10 +3679,10 @@
         <w:tblLayout w:type="fixed"/>
       </w:tblPr>
       <w:tblGrid>
-        <w:gridCol w:w="2660"/>
-        <w:gridCol w:w="2137"/>
-        <w:gridCol w:w="2314"/>
-        <w:gridCol w:w="1961"/>
+        <w:gridCol w:w="2534"/>
+        <w:gridCol w:w="2092"/>
+        <w:gridCol w:w="2274"/>
+        <w:gridCol w:w="2172"/>
       </w:tblGrid>
       <w:tr>
         <w:trPr>
@@ -3702,7 +3702,7 @@
               <w:bottom w:val="single" w:sz="16" w:space="0" w:color="B08625"/>
             </w:tcBorders>
             <w:vAlign w:val="center"/>
-            <w:tcW w:w="2660" w:type="dxa"/>
+            <w:tcW w:w="2534" w:type="dxa"/>
           </w:tcPr>
           <w:p>
             <w:pPr>
@@ -3733,7 +3733,7 @@
               <w:bottom w:val="single" w:sz="16" w:space="0" w:color="B08625"/>
             </w:tcBorders>
             <w:vAlign w:val="center"/>
-            <w:tcW w:w="2137" w:type="dxa"/>
+            <w:tcW w:w="2092" w:type="dxa"/>
           </w:tcPr>
           <w:p>
             <w:pPr>
@@ -3764,7 +3764,7 @@
               <w:bottom w:val="single" w:sz="16" w:space="0" w:color="B08625"/>
             </w:tcBorders>
             <w:vAlign w:val="center"/>
-            <w:tcW w:w="2314" w:type="dxa"/>
+            <w:tcW w:w="2274" w:type="dxa"/>
           </w:tcPr>
           <w:p>
             <w:pPr>
@@ -3795,7 +3795,7 @@
               <w:bottom w:val="single" w:sz="16" w:space="0" w:color="B08625"/>
             </w:tcBorders>
             <w:vAlign w:val="center"/>
-            <w:tcW w:w="1961" w:type="dxa"/>
+            <w:tcW w:w="2172" w:type="dxa"/>
           </w:tcPr>
           <w:p>
             <w:pPr>
@@ -3828,7 +3828,7 @@
             </w:tcMar>
             <w:vAlign w:val="center"/>
             <w:shd w:val="clear" w:color="auto" w:fill="F7F3E8"/>
-            <w:tcW w:w="2660" w:type="dxa"/>
+            <w:tcW w:w="2534" w:type="dxa"/>
           </w:tcPr>
           <w:p>
             <w:pPr>
@@ -3850,7 +3850,7 @@
             </w:tcMar>
             <w:vAlign w:val="center"/>
             <w:shd w:val="clear" w:color="auto" w:fill="F7F3E8"/>
-            <w:tcW w:w="2137" w:type="dxa"/>
+            <w:tcW w:w="2092" w:type="dxa"/>
           </w:tcPr>
           <w:p>
             <w:pPr>
@@ -3858,7 +3858,7 @@
               <w:jc w:val="left"/>
             </w:pPr>
             <w:r>
-              <w:t xml:space="preserve">Georgia</w:t>
+              <w:t xml:space="preserve">Fraunces</w:t>
             </w:r>
           </w:p>
         </w:tc>
@@ -3872,7 +3872,7 @@
             </w:tcMar>
             <w:vAlign w:val="center"/>
             <w:shd w:val="clear" w:color="auto" w:fill="F7F3E8"/>
-            <w:tcW w:w="2314" w:type="dxa"/>
+            <w:tcW w:w="2274" w:type="dxa"/>
           </w:tcPr>
           <w:p>
             <w:pPr>
@@ -3880,7 +3880,7 @@
               <w:jc w:val="left"/>
             </w:pPr>
             <w:r>
-              <w:t xml:space="preserve">Bold</w:t>
+              <w:t xml:space="preserve">Black</w:t>
             </w:r>
           </w:p>
         </w:tc>
@@ -3894,7 +3894,7 @@
             </w:tcMar>
             <w:vAlign w:val="center"/>
             <w:shd w:val="clear" w:color="auto" w:fill="F7F3E8"/>
-            <w:tcW w:w="1961" w:type="dxa"/>
+            <w:tcW w:w="2172" w:type="dxa"/>
           </w:tcPr>
           <w:p>
             <w:pPr>
@@ -3902,7 +3902,7 @@
               <w:jc w:val="left"/>
             </w:pPr>
             <w:r>
-              <w:t xml:space="preserve">18-36pt</w:t>
+              <w:t xml:space="preserve">22-42pt</w:t>
             </w:r>
           </w:p>
         </w:tc>
@@ -3920,7 +3920,7 @@
               <w:right w:w="150" w:type="dxa"/>
             </w:tcMar>
             <w:vAlign w:val="center"/>
-            <w:tcW w:w="2660" w:type="dxa"/>
+            <w:tcW w:w="2534" w:type="dxa"/>
           </w:tcPr>
           <w:p>
             <w:pPr>
@@ -3941,7 +3941,7 @@
               <w:right w:w="150" w:type="dxa"/>
             </w:tcMar>
             <w:vAlign w:val="center"/>
-            <w:tcW w:w="2137" w:type="dxa"/>
+            <w:tcW w:w="2092" w:type="dxa"/>
           </w:tcPr>
           <w:p>
             <w:pPr>
@@ -3949,7 +3949,7 @@
               <w:jc w:val="left"/>
             </w:pPr>
             <w:r>
-              <w:t xml:space="preserve">Georgia</w:t>
+              <w:t xml:space="preserve">Fraunces</w:t>
             </w:r>
           </w:p>
         </w:tc>
@@ -3962,7 +3962,7 @@
               <w:right w:w="150" w:type="dxa"/>
             </w:tcMar>
             <w:vAlign w:val="center"/>
-            <w:tcW w:w="2314" w:type="dxa"/>
+            <w:tcW w:w="2274" w:type="dxa"/>
           </w:tcPr>
           <w:p>
             <w:pPr>
@@ -3970,7 +3970,7 @@
               <w:jc w:val="left"/>
             </w:pPr>
             <w:r>
-              <w:t xml:space="preserve">Bold Italic</w:t>
+              <w:t xml:space="preserve">SemiBold</w:t>
             </w:r>
           </w:p>
         </w:tc>
@@ -3983,7 +3983,7 @@
               <w:right w:w="150" w:type="dxa"/>
             </w:tcMar>
             <w:vAlign w:val="center"/>
-            <w:tcW w:w="1961" w:type="dxa"/>
+            <w:tcW w:w="2172" w:type="dxa"/>
           </w:tcPr>
           <w:p>
             <w:pPr>
@@ -3991,7 +3991,7 @@
               <w:jc w:val="left"/>
             </w:pPr>
             <w:r>
-              <w:t xml:space="preserve">14-18pt</w:t>
+              <w:t xml:space="preserve">16-20pt</w:t>
             </w:r>
           </w:p>
         </w:tc>
@@ -4010,7 +4010,7 @@
             </w:tcMar>
             <w:vAlign w:val="center"/>
             <w:shd w:val="clear" w:color="auto" w:fill="F7F3E8"/>
-            <w:tcW w:w="2660" w:type="dxa"/>
+            <w:tcW w:w="2534" w:type="dxa"/>
           </w:tcPr>
           <w:p>
             <w:pPr>
@@ -4032,7 +4032,7 @@
             </w:tcMar>
             <w:vAlign w:val="center"/>
             <w:shd w:val="clear" w:color="auto" w:fill="F7F3E8"/>
-            <w:tcW w:w="2137" w:type="dxa"/>
+            <w:tcW w:w="2092" w:type="dxa"/>
           </w:tcPr>
           <w:p>
             <w:pPr>
@@ -4040,7 +4040,7 @@
               <w:jc w:val="left"/>
             </w:pPr>
             <w:r>
-              <w:t xml:space="preserve">Times New Roman</w:t>
+              <w:t xml:space="preserve">Source Serif 4</w:t>
             </w:r>
           </w:p>
         </w:tc>
@@ -4054,7 +4054,7 @@
             </w:tcMar>
             <w:vAlign w:val="center"/>
             <w:shd w:val="clear" w:color="auto" w:fill="F7F3E8"/>
-            <w:tcW w:w="2314" w:type="dxa"/>
+            <w:tcW w:w="2274" w:type="dxa"/>
           </w:tcPr>
           <w:p>
             <w:pPr>
@@ -4076,7 +4076,7 @@
             </w:tcMar>
             <w:vAlign w:val="center"/>
             <w:shd w:val="clear" w:color="auto" w:fill="F7F3E8"/>
-            <w:tcW w:w="1961" w:type="dxa"/>
+            <w:tcW w:w="2172" w:type="dxa"/>
           </w:tcPr>
           <w:p>
             <w:pPr>
@@ -4084,7 +4084,7 @@
               <w:jc w:val="left"/>
             </w:pPr>
             <w:r>
-              <w:t xml:space="preserve">11-12pt</w:t>
+              <w:t xml:space="preserve">10.5-11pt</w:t>
             </w:r>
           </w:p>
         </w:tc>
@@ -4102,7 +4102,7 @@
               <w:right w:w="150" w:type="dxa"/>
             </w:tcMar>
             <w:vAlign w:val="center"/>
-            <w:tcW w:w="2660" w:type="dxa"/>
+            <w:tcW w:w="2534" w:type="dxa"/>
           </w:tcPr>
           <w:p>
             <w:pPr>
@@ -4123,7 +4123,7 @@
               <w:right w:w="150" w:type="dxa"/>
             </w:tcMar>
             <w:vAlign w:val="center"/>
-            <w:tcW w:w="2137" w:type="dxa"/>
+            <w:tcW w:w="2092" w:type="dxa"/>
           </w:tcPr>
           <w:p>
             <w:pPr>
@@ -4131,7 +4131,7 @@
               <w:jc w:val="left"/>
             </w:pPr>
             <w:r>
-              <w:t xml:space="preserve">Times New Roman</w:t>
+              <w:t xml:space="preserve">Archivo</w:t>
             </w:r>
           </w:p>
         </w:tc>
@@ -4144,7 +4144,7 @@
               <w:right w:w="150" w:type="dxa"/>
             </w:tcMar>
             <w:vAlign w:val="center"/>
-            <w:tcW w:w="2314" w:type="dxa"/>
+            <w:tcW w:w="2274" w:type="dxa"/>
           </w:tcPr>
           <w:p>
             <w:pPr>
@@ -4152,7 +4152,7 @@
               <w:jc w:val="left"/>
             </w:pPr>
             <w:r>
-              <w:t xml:space="preserve">Italic</w:t>
+              <w:t xml:space="preserve">Bold, Small Caps</w:t>
             </w:r>
           </w:p>
         </w:tc>
@@ -4165,7 +4165,7 @@
               <w:right w:w="150" w:type="dxa"/>
             </w:tcMar>
             <w:vAlign w:val="center"/>
-            <w:tcW w:w="1961" w:type="dxa"/>
+            <w:tcW w:w="2172" w:type="dxa"/>
           </w:tcPr>
           <w:p>
             <w:pPr>

</xml_diff>